<commit_message>
fix: Nadia — Inicial Presentismo corrige cómo consultar la condición de regularidad (⋮ → Reporte → Histórico-Condición)
</commit_message>
<xml_diff>
--- a/public/manuales/Manual_Presentismo_Inicial_2026.docx
+++ b/public/manuales/Manual_Presentismo_Inicial_2026.docx
@@ -3493,7 +3493,64 @@
           <w:sz w:val="18"/>
           <w:szCs w:val="18"/>
         </w:rPr>
-        <w:t xml:space="preserve">La regularidad NO se visualiza dentro del módulo de Presentismo. Se consulta desde el módulo de Matriculados, en el listado de alumnos de la sala. Aparece como texto junto a cada alumno: Regular, No regular o Datos insuficientes.</w:t>
+        <w:t xml:space="preserve">La condición de regularidad se consulta desde el módulo de Presentismo de dos formas:</w:t>
+      </w:r>
+    </w:p>
+    <w:p>
+      <w:pPr>
+        <w:pBdr>
+          <w:bottom w:val="single" w:color="073244" w:sz="4" w:space="4"/>
+          <w:left w:val="single" w:color="073244" w:sz="8" w:space="8"/>
+        </w:pBdr>
+        <w:spacing w:after="140" w:before="0"/>
+        <w:ind w:left="360"/>
+      </w:pPr>
+      <w:r>
+        <w:rPr>
+          <w:rFonts w:ascii="Archivo" w:cs="Archivo" w:eastAsia="Archivo" w:hAnsi="Archivo"/>
+          <w:color w:val="333333"/>
+          <w:sz w:val="18"/>
+          <w:szCs w:val="18"/>
+        </w:rPr>
+        <w:t xml:space="preserve">1. En el resumen del estudiante aparece el campo "Condición" con el estado actual.</w:t>
+      </w:r>
+    </w:p>
+    <w:p>
+      <w:pPr>
+        <w:pBdr>
+          <w:bottom w:val="single" w:color="073244" w:sz="4" w:space="4"/>
+          <w:left w:val="single" w:color="073244" w:sz="8" w:space="8"/>
+        </w:pBdr>
+        <w:spacing w:after="140" w:before="0"/>
+        <w:ind w:left="360"/>
+      </w:pPr>
+      <w:r>
+        <w:rPr>
+          <w:rFonts w:ascii="Archivo" w:cs="Archivo" w:eastAsia="Archivo" w:hAnsi="Archivo"/>
+          <w:color w:val="333333"/>
+          <w:sz w:val="18"/>
+          <w:szCs w:val="18"/>
+        </w:rPr>
+        <w:t xml:space="preserve">2. Para ver el histórico por bimestre: en el listado de alumnos, hacé clic en los tres puntos (⋮) del estudiante → seleccioná "Reporte" → en el panel "Histórico - Condición" se muestra la condición bimestre por bimestre.</w:t>
+      </w:r>
+    </w:p>
+    <w:p>
+      <w:pPr>
+        <w:pBdr>
+          <w:bottom w:val="single" w:color="073244" w:sz="4" w:space="4"/>
+          <w:left w:val="single" w:color="073244" w:sz="8" w:space="8"/>
+        </w:pBdr>
+        <w:spacing w:after="140" w:before="0"/>
+        <w:ind w:left="360"/>
+      </w:pPr>
+      <w:r>
+        <w:rPr>
+          <w:rFonts w:ascii="Archivo" w:cs="Archivo" w:eastAsia="Archivo" w:hAnsi="Archivo"/>
+          <w:color w:val="333333"/>
+          <w:sz w:val="18"/>
+          <w:szCs w:val="18"/>
+        </w:rPr>
+        <w:t xml:space="preserve">En Nivel Inicial no existe una solapa de Regularidad separada.</w:t>
       </w:r>
     </w:p>
     <w:p>

</xml_diff>

<commit_message>
fix: umbral No regular → más de 5 inasistencias injustificadas (Manual_Presentismo_Inicial_2026.docx)
</commit_message>
<xml_diff>
--- a/public/manuales/Manual_Presentismo_Inicial_2026.docx
+++ b/public/manuales/Manual_Presentismo_Inicial_2026.docx
@@ -3778,7 +3778,7 @@
                 <w:sz w:val="18"/>
                 <w:szCs w:val="18"/>
               </w:rPr>
-              <w:t xml:space="preserve">Superó más de 25 inasistencias anuales sin justificar, o más del 15% de inasistencias en el bimestre.</w:t>
+              <w:t xml:space="preserve">Superó más de 5 inasistencias injustificadas.</w:t>
             </w:r>
           </w:p>
         </w:tc>
@@ -4132,7 +4132,7 @@
                 <w:sz w:val="18"/>
                 <w:szCs w:val="18"/>
               </w:rPr>
-              <w:t xml:space="preserve">Más de 25 inasistencias anuales sin justificar</w:t>
+              <w:t xml:space="preserve">Más de 5 inasistencias injustificadas</w:t>
             </w:r>
           </w:p>
         </w:tc>
@@ -4224,7 +4224,7 @@
                 <w:sz w:val="18"/>
                 <w:szCs w:val="18"/>
               </w:rPr>
-              <w:t xml:space="preserve">Más del 15% de inasistencias en el bimestre</w:t>
+              <w:t xml:space="preserve">Más de 5 inasistencias injustificadas</w:t>
             </w:r>
           </w:p>
         </w:tc>

</xml_diff>

<commit_message>
fix: tabla Prioridad — columna ancha + fila duplicada eliminada (Manual_Presentismo_Inicial_2026.docx)
</commit_message>
<xml_diff>
--- a/public/manuales/Manual_Presentismo_Inicial_2026.docx
+++ b/public/manuales/Manual_Presentismo_Inicial_2026.docx
@@ -3891,7 +3891,7 @@
         </w:trPr>
         <w:tc>
           <w:tcPr>
-            <w:tcW w:type="dxa" w:w="900"/>
+            <w:tcW w:type="dxa" w:w="1400"/>
             <w:tcBorders>
               <w:top w:val="single" w:color="073244" w:sz="1"/>
               <w:left w:val="single" w:color="073244" w:sz="1"/>
@@ -3922,7 +3922,7 @@
         </w:tc>
         <w:tc>
           <w:tcPr>
-            <w:tcW w:type="dxa" w:w="4200"/>
+            <w:tcW w:type="dxa" w:w="3700"/>
             <w:tcBorders>
               <w:top w:val="single" w:color="073244" w:sz="1"/>
               <w:left w:val="single" w:color="073244" w:sz="1"/>
@@ -3986,7 +3986,7 @@
       <w:tr>
         <w:tc>
           <w:tcPr>
-            <w:tcW w:type="dxa" w:w="900"/>
+            <w:tcW w:type="dxa" w:w="1400"/>
             <w:tcBorders>
               <w:top w:val="single" w:color="CCCCCC" w:sz="1"/>
               <w:left w:val="single" w:color="CCCCCC" w:sz="1"/>
@@ -4016,7 +4016,7 @@
         </w:tc>
         <w:tc>
           <w:tcPr>
-            <w:tcW w:type="dxa" w:w="4200"/>
+            <w:tcW w:type="dxa" w:w="3700"/>
             <w:tcBorders>
               <w:top w:val="single" w:color="CCCCCC" w:sz="1"/>
               <w:left w:val="single" w:color="CCCCCC" w:sz="1"/>
@@ -4078,7 +4078,7 @@
       <w:tr>
         <w:tc>
           <w:tcPr>
-            <w:tcW w:type="dxa" w:w="900"/>
+            <w:tcW w:type="dxa" w:w="1400"/>
             <w:tcBorders>
               <w:top w:val="single" w:color="CCCCCC" w:sz="1"/>
               <w:left w:val="single" w:color="CCCCCC" w:sz="1"/>
@@ -4108,7 +4108,7 @@
         </w:tc>
         <w:tc>
           <w:tcPr>
-            <w:tcW w:type="dxa" w:w="4200"/>
+            <w:tcW w:type="dxa" w:w="3700"/>
             <w:tcBorders>
               <w:top w:val="single" w:color="CCCCCC" w:sz="1"/>
               <w:left w:val="single" w:color="CCCCCC" w:sz="1"/>
@@ -4170,7 +4170,7 @@
       <w:tr>
         <w:tc>
           <w:tcPr>
-            <w:tcW w:type="dxa" w:w="900"/>
+            <w:tcW w:type="dxa" w:w="1400"/>
             <w:tcBorders>
               <w:top w:val="single" w:color="CCCCCC" w:sz="1"/>
               <w:left w:val="single" w:color="CCCCCC" w:sz="1"/>
@@ -4194,13 +4194,13 @@
                 <w:sz w:val="18"/>
                 <w:szCs w:val="18"/>
               </w:rPr>
-              <w:t xml:space="preserve">3°</w:t>
-            </w:r>
-          </w:p>
-        </w:tc>
-        <w:tc>
-          <w:tcPr>
-            <w:tcW w:type="dxa" w:w="4200"/>
+              <w:t xml:space="preserve">4°</w:t>
+            </w:r>
+          </w:p>
+        </w:tc>
+        <w:tc>
+          <w:tcPr>
+            <w:tcW w:type="dxa" w:w="3700"/>
             <w:tcBorders>
               <w:top w:val="single" w:color="CCCCCC" w:sz="1"/>
               <w:left w:val="single" w:color="CCCCCC" w:sz="1"/>
@@ -4224,7 +4224,7 @@
                 <w:sz w:val="18"/>
                 <w:szCs w:val="18"/>
               </w:rPr>
-              <w:t xml:space="preserve">Más de 5 inasistencias injustificadas</w:t>
+              <w:t xml:space="preserve">Datos insuficientes para calcular</w:t>
             </w:r>
           </w:p>
         </w:tc>
@@ -4254,7 +4254,7 @@
                 <w:sz w:val="18"/>
                 <w:szCs w:val="18"/>
               </w:rPr>
-              <w:t xml:space="preserve">No regular</w:t>
+              <w:t xml:space="preserve">Datos insuficientes</w:t>
             </w:r>
           </w:p>
         </w:tc>
@@ -4262,7 +4262,7 @@
       <w:tr>
         <w:tc>
           <w:tcPr>
-            <w:tcW w:type="dxa" w:w="900"/>
+            <w:tcW w:type="dxa" w:w="1400"/>
             <w:tcBorders>
               <w:top w:val="single" w:color="CCCCCC" w:sz="1"/>
               <w:left w:val="single" w:color="CCCCCC" w:sz="1"/>
@@ -4286,105 +4286,13 @@
                 <w:sz w:val="18"/>
                 <w:szCs w:val="18"/>
               </w:rPr>
-              <w:t xml:space="preserve">4°</w:t>
-            </w:r>
-          </w:p>
-        </w:tc>
-        <w:tc>
-          <w:tcPr>
-            <w:tcW w:type="dxa" w:w="4200"/>
-            <w:tcBorders>
-              <w:top w:val="single" w:color="CCCCCC" w:sz="1"/>
-              <w:left w:val="single" w:color="CCCCCC" w:sz="1"/>
-              <w:bottom w:val="single" w:color="CCCCCC" w:sz="1"/>
-              <w:right w:val="single" w:color="CCCCCC" w:sz="1"/>
-            </w:tcBorders>
-            <w:tcMar>
-              <w:top w:type="dxa" w:w="80"/>
-              <w:left w:type="dxa" w:w="120"/>
-              <w:bottom w:type="dxa" w:w="80"/>
-              <w:right w:type="dxa" w:w="120"/>
-            </w:tcMar>
-          </w:tcPr>
-          <w:p>
-            <w:r>
-              <w:rPr>
-                <w:rFonts w:ascii="Archivo" w:cs="Archivo" w:eastAsia="Archivo" w:hAnsi="Archivo"/>
-                <w:b w:val="false"/>
-                <w:bCs w:val="false"/>
-                <w:color w:val="222222"/>
-                <w:sz w:val="18"/>
-                <w:szCs w:val="18"/>
-              </w:rPr>
-              <w:t xml:space="preserve">Datos insuficientes para calcular</w:t>
-            </w:r>
-          </w:p>
-        </w:tc>
-        <w:tc>
-          <w:tcPr>
-            <w:tcW w:type="dxa" w:w="4926"/>
-            <w:tcBorders>
-              <w:top w:val="single" w:color="CCCCCC" w:sz="1"/>
-              <w:left w:val="single" w:color="CCCCCC" w:sz="1"/>
-              <w:bottom w:val="single" w:color="CCCCCC" w:sz="1"/>
-              <w:right w:val="single" w:color="CCCCCC" w:sz="1"/>
-            </w:tcBorders>
-            <w:tcMar>
-              <w:top w:type="dxa" w:w="80"/>
-              <w:left w:type="dxa" w:w="120"/>
-              <w:bottom w:type="dxa" w:w="80"/>
-              <w:right w:type="dxa" w:w="120"/>
-            </w:tcMar>
-          </w:tcPr>
-          <w:p>
-            <w:r>
-              <w:rPr>
-                <w:rFonts w:ascii="Archivo" w:cs="Archivo" w:eastAsia="Archivo" w:hAnsi="Archivo"/>
-                <w:b w:val="false"/>
-                <w:bCs w:val="false"/>
-                <w:color w:val="222222"/>
-                <w:sz w:val="18"/>
-                <w:szCs w:val="18"/>
-              </w:rPr>
-              <w:t xml:space="preserve">Datos insuficientes</w:t>
-            </w:r>
-          </w:p>
-        </w:tc>
-      </w:tr>
-      <w:tr>
-        <w:tc>
-          <w:tcPr>
-            <w:tcW w:type="dxa" w:w="900"/>
-            <w:tcBorders>
-              <w:top w:val="single" w:color="CCCCCC" w:sz="1"/>
-              <w:left w:val="single" w:color="CCCCCC" w:sz="1"/>
-              <w:bottom w:val="single" w:color="CCCCCC" w:sz="1"/>
-              <w:right w:val="single" w:color="CCCCCC" w:sz="1"/>
-            </w:tcBorders>
-            <w:tcMar>
-              <w:top w:type="dxa" w:w="80"/>
-              <w:left w:type="dxa" w:w="120"/>
-              <w:bottom w:type="dxa" w:w="80"/>
-              <w:right w:type="dxa" w:w="120"/>
-            </w:tcMar>
-          </w:tcPr>
-          <w:p>
-            <w:r>
-              <w:rPr>
-                <w:rFonts w:ascii="Archivo" w:cs="Archivo" w:eastAsia="Archivo" w:hAnsi="Archivo"/>
-                <w:b/>
-                <w:bCs/>
-                <w:color w:val="222222"/>
-                <w:sz w:val="18"/>
-                <w:szCs w:val="18"/>
-              </w:rPr>
               <w:t xml:space="preserve">5°</w:t>
             </w:r>
           </w:p>
         </w:tc>
         <w:tc>
           <w:tcPr>
-            <w:tcW w:type="dxa" w:w="4200"/>
+            <w:tcW w:type="dxa" w:w="3700"/>
             <w:tcBorders>
               <w:top w:val="single" w:color="CCCCCC" w:sz="1"/>
               <w:left w:val="single" w:color="CCCCCC" w:sz="1"/>

</xml_diff>

<commit_message>
fix: eliminar columna 'Cuenta para regularidad' (Manual_Presentismo_Inicial_2026.docx)
</commit_message>
<xml_diff>
--- a/public/manuales/Manual_Presentismo_Inicial_2026.docx
+++ b/public/manuales/Manual_Presentismo_Inicial_2026.docx
@@ -1169,7 +1169,6 @@
       <w:tblGrid>
         <w:gridCol w:w="2000"/>
         <w:gridCol w:w="4826"/>
-        <w:gridCol w:w="2200"/>
       </w:tblGrid>
       <w:tr>
         <w:trPr>
@@ -1237,37 +1236,6 @@
             </w:r>
           </w:p>
         </w:tc>
-        <w:tc>
-          <w:tcPr>
-            <w:tcW w:type="dxa" w:w="2200"/>
-            <w:tcBorders>
-              <w:top w:val="single" w:color="073244" w:sz="1"/>
-              <w:left w:val="single" w:color="073244" w:sz="1"/>
-              <w:bottom w:val="single" w:color="073244" w:sz="1"/>
-              <w:right w:val="single" w:color="073244" w:sz="1"/>
-            </w:tcBorders>
-            <w:shd w:fill="073244" w:color="auto" w:val="clear"/>
-            <w:tcMar>
-              <w:top w:type="dxa" w:w="80"/>
-              <w:left w:type="dxa" w:w="120"/>
-              <w:bottom w:type="dxa" w:w="80"/>
-              <w:right w:type="dxa" w:w="120"/>
-            </w:tcMar>
-          </w:tcPr>
-          <w:p>
-            <w:r>
-              <w:rPr>
-                <w:rFonts w:ascii="Archivo" w:cs="Archivo" w:eastAsia="Archivo" w:hAnsi="Archivo"/>
-                <w:b/>
-                <w:bCs/>
-                <w:color w:val="FFFFFF"/>
-                <w:sz w:val="18"/>
-                <w:szCs w:val="18"/>
-              </w:rPr>
-              <w:t xml:space="preserve">Cuenta para regularidad</w:t>
-            </w:r>
-          </w:p>
-        </w:tc>
       </w:tr>
       <w:tr>
         <w:tc>
@@ -1331,15 +1299,18 @@
             </w:r>
           </w:p>
         </w:tc>
-        <w:tc>
-          <w:tcPr>
-            <w:tcW w:type="dxa" w:w="2200"/>
+      </w:tr>
+      <w:tr>
+        <w:tc>
+          <w:tcPr>
+            <w:tcW w:type="dxa" w:w="2000"/>
             <w:tcBorders>
               <w:top w:val="single" w:color="CCCCCC" w:sz="1"/>
               <w:left w:val="single" w:color="CCCCCC" w:sz="1"/>
               <w:bottom w:val="single" w:color="CCCCCC" w:sz="1"/>
               <w:right w:val="single" w:color="CCCCCC" w:sz="1"/>
             </w:tcBorders>
+            <w:shd w:fill="FFECEC" w:color="auto" w:val="clear"/>
             <w:tcMar>
               <w:top w:type="dxa" w:w="80"/>
               <w:left w:type="dxa" w:w="120"/>
@@ -1357,22 +1328,19 @@
                 <w:sz w:val="18"/>
                 <w:szCs w:val="18"/>
               </w:rPr>
-              <w:t xml:space="preserve">No</w:t>
-            </w:r>
-          </w:p>
-        </w:tc>
-      </w:tr>
-      <w:tr>
-        <w:tc>
-          <w:tcPr>
-            <w:tcW w:type="dxa" w:w="2000"/>
+              <w:t xml:space="preserve">Ausente</w:t>
+            </w:r>
+          </w:p>
+        </w:tc>
+        <w:tc>
+          <w:tcPr>
+            <w:tcW w:type="dxa" w:w="4826"/>
             <w:tcBorders>
               <w:top w:val="single" w:color="CCCCCC" w:sz="1"/>
               <w:left w:val="single" w:color="CCCCCC" w:sz="1"/>
               <w:bottom w:val="single" w:color="CCCCCC" w:sz="1"/>
               <w:right w:val="single" w:color="CCCCCC" w:sz="1"/>
             </w:tcBorders>
-            <w:shd w:fill="FFECEC" w:color="auto" w:val="clear"/>
             <w:tcMar>
               <w:top w:type="dxa" w:w="80"/>
               <w:left w:type="dxa" w:w="120"/>
@@ -1390,19 +1358,22 @@
                 <w:sz w:val="18"/>
                 <w:szCs w:val="18"/>
               </w:rPr>
-              <w:t xml:space="preserve">Ausente</w:t>
-            </w:r>
-          </w:p>
-        </w:tc>
-        <w:tc>
-          <w:tcPr>
-            <w:tcW w:type="dxa" w:w="4826"/>
+              <w:t xml:space="preserve">No asistió. Genera inasistencia si no se justifica.</w:t>
+            </w:r>
+          </w:p>
+        </w:tc>
+      </w:tr>
+      <w:tr>
+        <w:tc>
+          <w:tcPr>
+            <w:tcW w:type="dxa" w:w="2000"/>
             <w:tcBorders>
               <w:top w:val="single" w:color="CCCCCC" w:sz="1"/>
               <w:left w:val="single" w:color="CCCCCC" w:sz="1"/>
               <w:bottom w:val="single" w:color="CCCCCC" w:sz="1"/>
               <w:right w:val="single" w:color="CCCCCC" w:sz="1"/>
             </w:tcBorders>
+            <w:shd w:fill="FFF3E0" w:color="auto" w:val="clear"/>
             <w:tcMar>
               <w:top w:type="dxa" w:w="80"/>
               <w:left w:type="dxa" w:w="120"/>
@@ -1420,13 +1391,13 @@
                 <w:sz w:val="18"/>
                 <w:szCs w:val="18"/>
               </w:rPr>
-              <w:t xml:space="preserve">No asistió. Genera inasistencia si no se justifica.</w:t>
-            </w:r>
-          </w:p>
-        </w:tc>
-        <w:tc>
-          <w:tcPr>
-            <w:tcW w:type="dxa" w:w="2200"/>
+              <w:t xml:space="preserve">Media jornada</w:t>
+            </w:r>
+          </w:p>
+        </w:tc>
+        <w:tc>
+          <w:tcPr>
+            <w:tcW w:type="dxa" w:w="4826"/>
             <w:tcBorders>
               <w:top w:val="single" w:color="CCCCCC" w:sz="1"/>
               <w:left w:val="single" w:color="CCCCCC" w:sz="1"/>
@@ -1450,7 +1421,7 @@
                 <w:sz w:val="18"/>
                 <w:szCs w:val="18"/>
               </w:rPr>
-              <w:t xml:space="preserve">Sí (sin justificar)</w:t>
+              <w:t xml:space="preserve">Asistió parcialmente.</w:t>
             </w:r>
           </w:p>
         </w:tc>
@@ -1465,7 +1436,7 @@
               <w:bottom w:val="single" w:color="CCCCCC" w:sz="1"/>
               <w:right w:val="single" w:color="CCCCCC" w:sz="1"/>
             </w:tcBorders>
-            <w:shd w:fill="FFF3E0" w:color="auto" w:val="clear"/>
+            <w:shd w:fill="F3E5F5" w:color="auto" w:val="clear"/>
             <w:tcMar>
               <w:top w:type="dxa" w:w="80"/>
               <w:left w:type="dxa" w:w="120"/>
@@ -1483,7 +1454,7 @@
                 <w:sz w:val="18"/>
                 <w:szCs w:val="18"/>
               </w:rPr>
-              <w:t xml:space="preserve">Media jornada</w:t>
+              <w:t xml:space="preserve">Llegada tarde</w:t>
             </w:r>
           </w:p>
         </w:tc>
@@ -1513,130 +1484,7 @@
                 <w:sz w:val="18"/>
                 <w:szCs w:val="18"/>
               </w:rPr>
-              <w:t xml:space="preserve">Asistió parcialmente.</w:t>
-            </w:r>
-          </w:p>
-        </w:tc>
-        <w:tc>
-          <w:tcPr>
-            <w:tcW w:type="dxa" w:w="2200"/>
-            <w:tcBorders>
-              <w:top w:val="single" w:color="CCCCCC" w:sz="1"/>
-              <w:left w:val="single" w:color="CCCCCC" w:sz="1"/>
-              <w:bottom w:val="single" w:color="CCCCCC" w:sz="1"/>
-              <w:right w:val="single" w:color="CCCCCC" w:sz="1"/>
-            </w:tcBorders>
-            <w:tcMar>
-              <w:top w:type="dxa" w:w="80"/>
-              <w:left w:type="dxa" w:w="120"/>
-              <w:bottom w:type="dxa" w:w="80"/>
-              <w:right w:type="dxa" w:w="120"/>
-            </w:tcMar>
-          </w:tcPr>
-          <w:p>
-            <w:r>
-              <w:rPr>
-                <w:rFonts w:ascii="Archivo" w:cs="Archivo" w:eastAsia="Archivo" w:hAnsi="Archivo"/>
-                <w:b w:val="false"/>
-                <w:bCs w:val="false"/>
-                <w:color w:val="222222"/>
-                <w:sz w:val="18"/>
-                <w:szCs w:val="18"/>
-              </w:rPr>
-              <w:t xml:space="preserve">Media inasistencia</w:t>
-            </w:r>
-          </w:p>
-        </w:tc>
-      </w:tr>
-      <w:tr>
-        <w:tc>
-          <w:tcPr>
-            <w:tcW w:type="dxa" w:w="2000"/>
-            <w:tcBorders>
-              <w:top w:val="single" w:color="CCCCCC" w:sz="1"/>
-              <w:left w:val="single" w:color="CCCCCC" w:sz="1"/>
-              <w:bottom w:val="single" w:color="CCCCCC" w:sz="1"/>
-              <w:right w:val="single" w:color="CCCCCC" w:sz="1"/>
-            </w:tcBorders>
-            <w:shd w:fill="F3E5F5" w:color="auto" w:val="clear"/>
-            <w:tcMar>
-              <w:top w:type="dxa" w:w="80"/>
-              <w:left w:type="dxa" w:w="120"/>
-              <w:bottom w:type="dxa" w:w="80"/>
-              <w:right w:type="dxa" w:w="120"/>
-            </w:tcMar>
-          </w:tcPr>
-          <w:p>
-            <w:r>
-              <w:rPr>
-                <w:rFonts w:ascii="Archivo" w:cs="Archivo" w:eastAsia="Archivo" w:hAnsi="Archivo"/>
-                <w:b w:val="false"/>
-                <w:bCs w:val="false"/>
-                <w:color w:val="222222"/>
-                <w:sz w:val="18"/>
-                <w:szCs w:val="18"/>
-              </w:rPr>
-              <w:t xml:space="preserve">Llegada tarde</w:t>
-            </w:r>
-          </w:p>
-        </w:tc>
-        <w:tc>
-          <w:tcPr>
-            <w:tcW w:type="dxa" w:w="4826"/>
-            <w:tcBorders>
-              <w:top w:val="single" w:color="CCCCCC" w:sz="1"/>
-              <w:left w:val="single" w:color="CCCCCC" w:sz="1"/>
-              <w:bottom w:val="single" w:color="CCCCCC" w:sz="1"/>
-              <w:right w:val="single" w:color="CCCCCC" w:sz="1"/>
-            </w:tcBorders>
-            <w:tcMar>
-              <w:top w:type="dxa" w:w="80"/>
-              <w:left w:type="dxa" w:w="120"/>
-              <w:bottom w:type="dxa" w:w="80"/>
-              <w:right w:type="dxa" w:w="120"/>
-            </w:tcMar>
-          </w:tcPr>
-          <w:p>
-            <w:r>
-              <w:rPr>
-                <w:rFonts w:ascii="Archivo" w:cs="Archivo" w:eastAsia="Archivo" w:hAnsi="Archivo"/>
-                <w:b w:val="false"/>
-                <w:bCs w:val="false"/>
-                <w:color w:val="222222"/>
-                <w:sz w:val="18"/>
-                <w:szCs w:val="18"/>
-              </w:rPr>
               <w:t xml:space="preserve">Ingresó fuera del horario establecido.</w:t>
-            </w:r>
-          </w:p>
-        </w:tc>
-        <w:tc>
-          <w:tcPr>
-            <w:tcW w:type="dxa" w:w="2200"/>
-            <w:tcBorders>
-              <w:top w:val="single" w:color="CCCCCC" w:sz="1"/>
-              <w:left w:val="single" w:color="CCCCCC" w:sz="1"/>
-              <w:bottom w:val="single" w:color="CCCCCC" w:sz="1"/>
-              <w:right w:val="single" w:color="CCCCCC" w:sz="1"/>
-            </w:tcBorders>
-            <w:tcMar>
-              <w:top w:type="dxa" w:w="80"/>
-              <w:left w:type="dxa" w:w="120"/>
-              <w:bottom w:type="dxa" w:w="80"/>
-              <w:right w:type="dxa" w:w="120"/>
-            </w:tcMar>
-          </w:tcPr>
-          <w:p>
-            <w:r>
-              <w:rPr>
-                <w:rFonts w:ascii="Archivo" w:cs="Archivo" w:eastAsia="Archivo" w:hAnsi="Archivo"/>
-                <w:b w:val="false"/>
-                <w:bCs w:val="false"/>
-                <w:color w:val="222222"/>
-                <w:sz w:val="18"/>
-                <w:szCs w:val="18"/>
-              </w:rPr>
-              <w:t xml:space="preserve">Según configuración</w:t>
             </w:r>
           </w:p>
         </w:tc>

</xml_diff>

<commit_message>
fix: agregar NC a tabla estados Inicial (Manual_Presentismo_Inicial_2026.docx)
</commit_message>
<xml_diff>
--- a/public/manuales/Manual_Presentismo_Inicial_2026.docx
+++ b/public/manuales/Manual_Presentismo_Inicial_2026.docx
@@ -1485,6 +1485,69 @@
                 <w:szCs w:val="18"/>
               </w:rPr>
               <w:t xml:space="preserve">Ingresó fuera del horario establecido.</w:t>
+            </w:r>
+          </w:p>
+        </w:tc>
+      </w:tr>
+      <w:tr>
+        <w:tc>
+          <w:tcPr>
+            <w:tcW w:type="dxa" w:w="2000"/>
+            <w:tcBorders>
+              <w:top w:val="single" w:color="CCCCCC" w:sz="1"/>
+              <w:left w:val="single" w:color="CCCCCC" w:sz="1"/>
+              <w:bottom w:val="single" w:color="CCCCCC" w:sz="1"/>
+              <w:right w:val="single" w:color="CCCCCC" w:sz="1"/>
+            </w:tcBorders>
+            <w:shd w:fill="F5F5F5" w:color="auto" w:val="clear"/>
+            <w:tcMar>
+              <w:top w:type="dxa" w:w="80"/>
+              <w:left w:type="dxa" w:w="120"/>
+              <w:bottom w:type="dxa" w:w="80"/>
+              <w:right w:type="dxa" w:w="120"/>
+            </w:tcMar>
+          </w:tcPr>
+          <w:p>
+            <w:r>
+              <w:rPr>
+                <w:rFonts w:ascii="Archivo" w:cs="Archivo" w:eastAsia="Archivo" w:hAnsi="Archivo"/>
+                <w:b w:val="false"/>
+                <w:bCs w:val="false"/>
+                <w:color w:val="222222"/>
+                <w:sz w:val="18"/>
+                <w:szCs w:val="18"/>
+              </w:rPr>
+              <w:t xml:space="preserve">NC (No Corresponde)</w:t>
+            </w:r>
+          </w:p>
+        </w:tc>
+        <w:tc>
+          <w:tcPr>
+            <w:tcW w:type="dxa" w:w="4826"/>
+            <w:tcBorders>
+              <w:top w:val="single" w:color="CCCCCC" w:sz="1"/>
+              <w:left w:val="single" w:color="CCCCCC" w:sz="1"/>
+              <w:bottom w:val="single" w:color="CCCCCC" w:sz="1"/>
+              <w:right w:val="single" w:color="CCCCCC" w:sz="1"/>
+            </w:tcBorders>
+            <w:tcMar>
+              <w:top w:type="dxa" w:w="80"/>
+              <w:left w:type="dxa" w:w="120"/>
+              <w:bottom w:type="dxa" w:w="80"/>
+              <w:right w:type="dxa" w:w="120"/>
+            </w:tcMar>
+          </w:tcPr>
+          <w:p>
+            <w:r>
+              <w:rPr>
+                <w:rFonts w:ascii="Archivo" w:cs="Archivo" w:eastAsia="Archivo" w:hAnsi="Archivo"/>
+                <w:b w:val="false"/>
+                <w:bCs w:val="false"/>
+                <w:color w:val="222222"/>
+                <w:sz w:val="18"/>
+                <w:szCs w:val="18"/>
+              </w:rPr>
+              <w:t xml:space="preserve">Uso excepcional: el alumno no está alcanzado por el presentismo en esa fecha. Disponible para todos los roles. Si el docente lo asignó por error, debe solicitar al Directivo que lo modifique.</w:t>
             </w:r>
           </w:p>
         </w:tc>

</xml_diff>